<commit_message>
docs: update phase 2 design docs and build files
</commit_message>
<xml_diff>
--- a/docs/phase_2/AgriContract_01_PhanTichThiTruong_v5.docx
+++ b/docs/phase_2/AgriContract_01_PhanTichThiTruong_v5.docx
@@ -1720,7 +1720,7 @@
           <w:sz w:val="21"/>
           <w:szCs w:val="21"/>
         </w:rPr>
-        <w:t xml:space="preserve">Bẻ kèo không phải giả định của nhóm — báo chí và cơ quan quản lý gọi thẳng tên trong năm 2026. </w:t>
+        <w:t xml:space="preserve">Phá hợp đồng không phải giả định của nhóm — báo chí và cơ quan quản lý gọi thẳng tên (“bẻ kèo”) trong năm 2026. </w:t>
       </w:r>
       <w:r>
         <w:rPr>
@@ -1733,7 +1733,7 @@
           <w:sz w:val="21"/>
           <w:szCs w:val="21"/>
         </w:rPr>
-        <w:t xml:space="preserve">Đài Tiếng nói Việt Nam (06/2026) mô tả tình trạng nông dân rũ bỏ cam kết đã ký khi thương lái đẩy giá, và nhấn mạnh rằng khi bẻ kèo xảy ra thì gần như không tồn tại cơ chế pháp lý đủ mạnh để bảo vệ quyền lợi — đây chính là khoảng trống mà AgriContract lấp. Báo Đắk Lắk (2024) ghi nhận điệp khúc “chặt–trồng, bẻ cọc, bẻ kèo” phá vỡ liên kết ngay tại vùng cà phê Tây Nguyên, thị trường lõi của hệ thống.</w:t>
+        <w:t xml:space="preserve">Đài Tiếng nói Việt Nam (06/2026) mô tả tình trạng nông dân rũ bỏ cam kết đã ký khi thương lái đẩy giá, và nhấn mạnh rằng khi phá hợp đồng xảy ra thì gần như không tồn tại cơ chế pháp lý đủ mạnh để bảo vệ quyền lợi — đây chính là khoảng trống mà AgriContract lấp. Báo Đắk Lắk (2024) ghi nhận điệp khúc “chặt–trồng, bẻ cọc, bẻ kèo” phá vỡ liên kết ngay tại vùng cà phê Tây Nguyên, thị trường lõi của hệ thống.</w:t>
       </w:r>
     </w:p>
     <w:p>
@@ -1765,7 +1765,7 @@
           <w:sz w:val="21"/>
           <w:szCs w:val="21"/>
         </w:rPr>
-        <w:t xml:space="preserve">Tạp chí Kinh tế Môi trường (VFC, 06/2026) xác nhận hợp đồng bao tiêu bị phá vỡ ở cả hai phía: khi giá thị trường vượt giá hợp đồng, một bộ phận nông dân bán ra ngoài; khi giá xuống dưới giá đã ký, một số doanh nghiệp từ chối thu mua hoặc ép giá lại. Vụ doanh nghiệp viện “bất khả kháng” không thu mua khoảng 2.000 tấn đu đủ như cam kết là ví dụ cụ thể cho nhánh doanh nghiệp bẻ kèo. Đây là căn cứ thực tế cho cơ chế penalty/lock đối xứng của AgriContract — cả bên mua lẫn bên bán đều chịu ràng buộc, không phải chỉ bảo vệ một phía.</w:t>
+        <w:t xml:space="preserve">Tạp chí Kinh tế Môi trường (VFC, 06/2026) xác nhận hợp đồng bao tiêu bị phá vỡ ở cả hai phía: khi giá thị trường vượt giá hợp đồng, một bộ phận nông dân bán ra ngoài; khi giá xuống dưới giá đã ký, một số doanh nghiệp từ chối thu mua hoặc ép giá lại. Vụ doanh nghiệp viện “bất khả kháng” không thu mua khoảng 2.000 tấn đu đủ như cam kết là ví dụ cụ thể cho nhánh doanh nghiệp phá hợp đồng. Đây là căn cứ thực tế cho cơ chế penalty/lock đối xứng của AgriContract — cả bên mua lẫn bên bán đều chịu ràng buộc, không phải chỉ bảo vệ một phía.</w:t>
       </w:r>
     </w:p>
     <w:p>

</xml_diff>